<commit_message>
Update demo conclusion fixtures
</commit_message>
<xml_diff>
--- a/demo/fixtures/ClaimTrace_Demo_Canadian_Grocery_Bad_Conclusion.docx
+++ b/demo/fixtures/ClaimTrace_Demo_Canadian_Grocery_Bad_Conclusion.docx
@@ -5,9 +5,6 @@
     <w:p>
       <w:pPr>
         <w:spacing w:after="20"/>
-        <w:rPr>
-          <w:rFonts w:hint="eastAsia"/>
-        </w:rPr>
       </w:pPr>
       <w:r>
         <w:rPr>
@@ -29,9 +26,6 @@
     <w:p>
       <w:pPr>
         <w:spacing w:after="120"/>
-        <w:rPr>
-          <w:rFonts w:hint="eastAsia"/>
-        </w:rPr>
       </w:pPr>
       <w:r>
         <w:rPr>
@@ -54,15 +48,18 @@
       <w:pPr>
         <w:keepLines/>
         <w:spacing w:after="60"/>
-        <w:rPr>
-          <w:rFonts w:hint="eastAsia"/>
-        </w:rPr>
       </w:pPr>
       <w:r>
-        <w:t>Food purchased from stores was 4.3% more expensive in May 2026 than a year earlier, compared with 3.2% headline CPI inflation [1].</w:t>
+        <w:t>Food purchased from stores accelerated, rising 4.3% year over year in May, for the 16</w:t>
       </w:r>
       <w:r>
-        <w:t xml:space="preserve"> </w:t>
+        <w:rPr>
+          <w:vertAlign w:val="superscript"/>
+        </w:rPr>
+        <w:t>th</w:t>
+      </w:r>
+      <w:r>
+        <w:t xml:space="preserve"> consecutive month, compared with 3.2% headline CPI inflation in 2026 [1]. </w:t>
       </w:r>
       <w:r>
         <w:t>The gap suggests that a household necessity was becoming more expensive than the average basket of goods and services.</w:t>
@@ -112,9 +109,6 @@
         <w:keepLines/>
         <w:spacing w:after="60"/>
         <w:ind w:firstLine="720"/>
-        <w:rPr>
-          <w:rFonts w:hint="eastAsia"/>
-        </w:rPr>
       </w:pPr>
       <w:r>
         <w:t>On an annual-average basis, grocery prices increased 3.5% in 2025 after rising 2.2% in 2024 [3].</w:t>
@@ -124,9 +118,6 @@
       <w:pPr>
         <w:keepLines/>
         <w:spacing w:after="60"/>
-        <w:rPr>
-          <w:rFonts w:hint="eastAsia"/>
-        </w:rPr>
       </w:pPr>
       <w:r>
         <w:t>The year-over-year comparison points to faster grocery price growth in the later period rather than a clear easing trend.</w:t>
@@ -143,9 +134,6 @@
         <w:keepLines/>
         <w:spacing w:after="60"/>
         <w:ind w:firstLine="720"/>
-        <w:rPr>
-          <w:rFonts w:hint="eastAsia"/>
-        </w:rPr>
       </w:pPr>
       <w:r>
         <w:t>The 2026 Canada Food Price Report forecast that overall food prices would increase by 4% to 6% during 2026 [8].</w:t>
@@ -161,9 +149,6 @@
       <w:pPr>
         <w:keepLines/>
         <w:spacing w:after="60"/>
-        <w:rPr>
-          <w:rFonts w:hint="eastAsia"/>
-        </w:rPr>
       </w:pPr>
       <w:r>
         <w:t>A forecast is not an observed result, but it supports maintaining flexibility in pricing, promotions, and assortment decisions while the cost outlook remains unsettled.</w:t>
@@ -173,9 +158,6 @@
       <w:pPr>
         <w:keepLines/>
         <w:spacing w:after="60"/>
-        <w:rPr>
-          <w:rFonts w:hint="eastAsia"/>
-        </w:rPr>
       </w:pPr>
       <w:r>
         <w:t>Fresh vegetable prices rose 9.0% year over year in May 2026 [1].</w:t>
@@ -207,9 +189,6 @@
         <w:keepLines/>
         <w:spacing w:after="60"/>
         <w:ind w:firstLine="720"/>
-        <w:rPr>
-          <w:rFonts w:hint="eastAsia"/>
-        </w:rPr>
       </w:pPr>
       <w:r>
         <w:t>Loblaw reported first-quarter retail revenue of $14.484 billion, up 4.2% from the prior-year quarter [4].</w:t>
@@ -238,9 +217,6 @@
         <w:keepLines/>
         <w:spacing w:after="60"/>
         <w:ind w:firstLine="720"/>
-        <w:rPr>
-          <w:rFonts w:hint="eastAsia"/>
-        </w:rPr>
       </w:pPr>
       <w:r>
         <w:t>METRO reported second-quarter sales of $5.113 billion, up 4.1% from the prior-year quarter [5].</w:t>
@@ -263,9 +239,6 @@
         <w:keepLines/>
         <w:spacing w:after="60"/>
         <w:ind w:firstLine="720"/>
-        <w:rPr>
-          <w:rFonts w:hint="eastAsia"/>
-        </w:rPr>
       </w:pPr>
       <w:r>
         <w:t>Empire recorded a $746 million e-commerce impairment in the third quarter of fiscal 2026 [6].</w:t>
@@ -275,9 +248,6 @@
       <w:pPr>
         <w:keepLines/>
         <w:spacing w:after="60"/>
-        <w:rPr>
-          <w:rFonts w:hint="eastAsia"/>
-        </w:rPr>
       </w:pPr>
       <w:r>
         <w:t>An impairment of this size signals that the expected value of a prior investment was reassessed materially downward.</w:t>
@@ -312,9 +282,6 @@
         <w:keepLines/>
         <w:spacing w:after="60"/>
         <w:ind w:firstLine="720"/>
-        <w:rPr>
-          <w:rFonts w:hint="eastAsia"/>
-        </w:rPr>
       </w:pPr>
       <w:r>
         <w:lastRenderedPageBreak/>
@@ -347,9 +314,6 @@
         <w:keepLines/>
         <w:spacing w:after="60"/>
         <w:ind w:firstLine="720"/>
-        <w:rPr>
-          <w:rFonts w:hint="eastAsia"/>
-        </w:rPr>
       </w:pPr>
       <w:r>
         <w:t>Prices for computer equipment, software and supplies went up by approximately 4% on a YoY basis in May after a 0.2% decline in the month before [10].</w:t>
@@ -390,9 +354,6 @@
         <w:keepLines/>
         <w:spacing w:after="60"/>
         <w:ind w:firstLine="720"/>
-        <w:rPr>
-          <w:rFonts w:hint="eastAsia"/>
-        </w:rPr>
       </w:pPr>
       <w:r>
         <w:t>Grocery prices increased 2.2% on an annual-average basis in 2024 [3].</w:t>
@@ -426,9 +387,6 @@
       <w:pPr>
         <w:keepLines/>
         <w:spacing w:after="60"/>
-        <w:rPr>
-          <w:rFonts w:hint="eastAsia"/>
-        </w:rPr>
       </w:pPr>
       <w:r>
         <w:t>For strategy teams, a change of this kind would shift attention toward productivity, store economics, and category performance within the existing footprint.</w:t>
@@ -439,9 +397,6 @@
         <w:keepLines/>
         <w:spacing w:after="60"/>
         <w:ind w:firstLine="720"/>
-        <w:rPr>
-          <w:rFonts w:hint="eastAsia"/>
-        </w:rPr>
       </w:pPr>
       <w:r>
         <w:t>METRO reported adjusted second-quarter net earnings of $236.5 million, up 4.4% from the prior-year quarter [5].</w:t>
@@ -472,9 +427,6 @@
       <w:pPr>
         <w:spacing w:after="60"/>
         <w:ind w:firstLine="720"/>
-        <w:rPr>
-          <w:rFonts w:hint="eastAsia"/>
-        </w:rPr>
       </w:pPr>
       <w:r>
         <w:t>The evidence shows that Canadian grocery shoppers have moved beyond affordability concerns and are now demonstrating broad willingness to absorb higher prices. Food inflation above headline CPI should be read as confirmation that consumers are accepting premium price points, while rising retailer revenue and earnings demonstrate that this willingness is translating into sustainable demand.</w:t>
@@ -484,9 +436,6 @@
       <w:pPr>
         <w:spacing w:after="60"/>
         <w:ind w:firstLine="720"/>
-        <w:rPr>
-          <w:rFonts w:hint="eastAsia"/>
-        </w:rPr>
       </w:pPr>
       <w:r>
         <w:t>The recommended response is to reduce broad investment in value propositions, including discount positioning, price-match activity, and private-label expansion. Retailers should instead reallocate shelf space, marketing, and category investment toward mainstream premiumization because higher nominal sales are evidence that consumers have regained purchasing power and will reward higher-margin offers.</w:t>
@@ -496,9 +445,6 @@
       <w:pPr>
         <w:spacing w:after="100"/>
         <w:ind w:firstLine="720"/>
-        <w:rPr>
-          <w:rFonts w:hint="eastAsia"/>
-        </w:rPr>
       </w:pPr>
       <w:r>
         <w:t>This approach should be applied across the market rather than targeted by category, since the available figures collectively show that price sensitivity is no longer a material constraint on grocery demand.</w:t>
@@ -518,7 +464,6 @@
         <w:spacing w:after="0" w:line="211" w:lineRule="auto"/>
         <w:ind w:left="187" w:hanging="187"/>
         <w:rPr>
-          <w:rFonts w:hint="eastAsia"/>
           <w:szCs w:val="21"/>
         </w:rPr>
       </w:pPr>
@@ -534,7 +479,6 @@
         <w:spacing w:after="0" w:line="211" w:lineRule="auto"/>
         <w:ind w:left="187" w:hanging="187"/>
         <w:rPr>
-          <w:rFonts w:hint="eastAsia"/>
           <w:szCs w:val="21"/>
         </w:rPr>
       </w:pPr>
@@ -550,7 +494,6 @@
         <w:spacing w:after="0" w:line="211" w:lineRule="auto"/>
         <w:ind w:left="187" w:hanging="187"/>
         <w:rPr>
-          <w:rFonts w:hint="eastAsia"/>
           <w:szCs w:val="21"/>
         </w:rPr>
       </w:pPr>
@@ -566,7 +509,6 @@
         <w:spacing w:after="0" w:line="211" w:lineRule="auto"/>
         <w:ind w:left="187" w:hanging="187"/>
         <w:rPr>
-          <w:rFonts w:hint="eastAsia"/>
           <w:szCs w:val="21"/>
         </w:rPr>
       </w:pPr>
@@ -582,7 +524,6 @@
         <w:spacing w:after="0" w:line="211" w:lineRule="auto"/>
         <w:ind w:left="187" w:hanging="187"/>
         <w:rPr>
-          <w:rFonts w:hint="eastAsia"/>
           <w:szCs w:val="21"/>
         </w:rPr>
       </w:pPr>
@@ -599,7 +540,6 @@
         <w:spacing w:after="0" w:line="211" w:lineRule="auto"/>
         <w:ind w:left="187" w:hanging="187"/>
         <w:rPr>
-          <w:rFonts w:hint="eastAsia"/>
           <w:szCs w:val="21"/>
         </w:rPr>
       </w:pPr>
@@ -615,7 +555,6 @@
         <w:spacing w:after="0" w:line="211" w:lineRule="auto"/>
         <w:ind w:left="187" w:hanging="187"/>
         <w:rPr>
-          <w:rFonts w:hint="eastAsia"/>
           <w:szCs w:val="21"/>
         </w:rPr>
       </w:pPr>
@@ -631,7 +570,6 @@
         <w:spacing w:after="0" w:line="211" w:lineRule="auto"/>
         <w:ind w:left="187" w:hanging="187"/>
         <w:rPr>
-          <w:rFonts w:hint="eastAsia"/>
           <w:szCs w:val="21"/>
         </w:rPr>
       </w:pPr>
@@ -647,7 +585,6 @@
         <w:spacing w:after="0" w:line="211" w:lineRule="auto"/>
         <w:ind w:left="187" w:hanging="187"/>
         <w:rPr>
-          <w:rFonts w:hint="eastAsia"/>
           <w:szCs w:val="21"/>
         </w:rPr>
       </w:pPr>
@@ -663,7 +600,6 @@
         <w:spacing w:after="0" w:line="211" w:lineRule="auto"/>
         <w:ind w:left="187" w:hanging="187"/>
         <w:rPr>
-          <w:rFonts w:hint="eastAsia"/>
           <w:szCs w:val="21"/>
         </w:rPr>
       </w:pPr>
@@ -691,9 +627,6 @@
     <w:p>
       <w:pPr>
         <w:spacing w:after="0" w:line="240" w:lineRule="auto"/>
-        <w:rPr>
-          <w:rFonts w:hint="eastAsia"/>
-        </w:rPr>
       </w:pPr>
       <w:r>
         <w:separator/>
@@ -704,9 +637,6 @@
     <w:p>
       <w:pPr>
         <w:spacing w:after="0" w:line="240" w:lineRule="auto"/>
-        <w:rPr>
-          <w:rFonts w:hint="eastAsia"/>
-        </w:rPr>
       </w:pPr>
       <w:r>
         <w:continuationSeparator/>
@@ -722,9 +652,6 @@
     <w:pPr>
       <w:pStyle w:val="Footer"/>
       <w:jc w:val="right"/>
-      <w:rPr>
-        <w:rFonts w:hint="eastAsia"/>
-      </w:rPr>
     </w:pPr>
     <w:r>
       <w:rPr>
@@ -773,9 +700,6 @@
     <w:p>
       <w:pPr>
         <w:spacing w:after="0" w:line="240" w:lineRule="auto"/>
-        <w:rPr>
-          <w:rFonts w:hint="eastAsia"/>
-        </w:rPr>
       </w:pPr>
       <w:r>
         <w:separator/>
@@ -786,9 +710,6 @@
     <w:p>
       <w:pPr>
         <w:spacing w:after="0" w:line="240" w:lineRule="auto"/>
-        <w:rPr>
-          <w:rFonts w:hint="eastAsia"/>
-        </w:rPr>
       </w:pPr>
       <w:r>
         <w:continuationSeparator/>

</xml_diff>